<commit_message>
Refine homepage profile placement
</commit_message>
<xml_diff>
--- a/ChristianMueth_creative_writings/short fiction/Christian Mueth Summer 2026 Poems.docx
+++ b/ChristianMueth_creative_writings/short fiction/Christian Mueth Summer 2026 Poems.docx
@@ -37,7 +37,7 @@
         <w:rPr>
           <w:rFonts w:cs="Segoe UI Emoji"/>
         </w:rPr>
-        <w:t>Poems:</w:t>
+        <w:t>Poems</w:t>
       </w:r>
     </w:p>
     <w:p>
@@ -166,248 +166,218 @@
           <w:u w:val="single"/>
         </w:rPr>
       </w:pPr>
-      <w:proofErr w:type="gramStart"/>
       <w:r>
         <w:rPr>
           <w:b/>
           <w:bCs/>
           <w:u w:val="single"/>
         </w:rPr>
-        <w:t>Panned</w:t>
-      </w:r>
-      <w:proofErr w:type="gramEnd"/>
-      <w:r>
+        <w:t>Panned:</w:t>
+      </w:r>
+    </w:p>
+    <w:p>
+      <w:pPr>
+        <w:jc w:val="both"/>
+        <w:rPr>
+          <w:rFonts w:cs="Segoe UI Emoji"/>
+          <w:i/>
+          <w:iCs/>
+        </w:rPr>
+      </w:pPr>
+      <w:r>
+        <w:rPr>
+          <w:rFonts w:cs="Segoe UI Emoji"/>
+          <w:i/>
+          <w:iCs/>
+        </w:rPr>
+        <w:t>Wendy darling,</w:t>
+      </w:r>
+    </w:p>
+    <w:p>
+      <w:pPr>
+        <w:jc w:val="both"/>
+        <w:rPr>
+          <w:rFonts w:cs="Segoe UI Emoji"/>
+          <w:i/>
+          <w:iCs/>
+        </w:rPr>
+      </w:pPr>
+      <w:r>
+        <w:rPr>
+          <w:rFonts w:cs="Segoe UI Emoji"/>
+          <w:i/>
+          <w:iCs/>
+        </w:rPr>
+        <w:t>Your eyes, sterling,</w:t>
+      </w:r>
+    </w:p>
+    <w:p>
+      <w:pPr>
+        <w:jc w:val="both"/>
+        <w:rPr>
+          <w:rFonts w:cs="Segoe UI Emoji"/>
+          <w:i/>
+          <w:iCs/>
+        </w:rPr>
+      </w:pPr>
+      <w:r>
+        <w:rPr>
+          <w:rFonts w:cs="Segoe UI Emoji"/>
+          <w:i/>
+          <w:iCs/>
+        </w:rPr>
+        <w:t>End me, darling!</w:t>
+      </w:r>
+    </w:p>
+    <w:p>
+      <w:pPr>
+        <w:jc w:val="both"/>
+        <w:rPr>
+          <w:rFonts w:cs="Segoe UI Emoji"/>
+          <w:i/>
+          <w:iCs/>
+        </w:rPr>
+      </w:pPr>
+      <w:r>
+        <w:rPr>
+          <w:rFonts w:cs="Segoe UI Emoji"/>
+          <w:i/>
+          <w:iCs/>
+        </w:rPr>
+        <w:t>Heart’s unfurling.</w:t>
+      </w:r>
+    </w:p>
+    <w:p>
+      <w:pPr>
+        <w:jc w:val="both"/>
+        <w:rPr>
+          <w:rFonts w:cs="Segoe UI Emoji"/>
+          <w:i/>
+          <w:iCs/>
+        </w:rPr>
+      </w:pPr>
+      <w:r>
+        <w:rPr>
+          <w:rFonts w:cs="Segoe UI Emoji"/>
+          <w:i/>
+          <w:iCs/>
+        </w:rPr>
+        <w:t>Kiss. Ease hooks in me.</w:t>
+      </w:r>
+    </w:p>
+    <w:p>
+      <w:pPr>
+        <w:jc w:val="both"/>
+        <w:rPr>
+          <w:rFonts w:cs="Segoe UI Emoji"/>
+          <w:i/>
+          <w:iCs/>
+        </w:rPr>
+      </w:pPr>
+      <w:r>
+        <w:rPr>
+          <w:rFonts w:cs="Segoe UI Emoji"/>
+          <w:i/>
+          <w:iCs/>
+        </w:rPr>
+        <w:t>Miss. Please set me free!</w:t>
+      </w:r>
+    </w:p>
+    <w:p>
+      <w:pPr>
+        <w:jc w:val="both"/>
+        <w:rPr>
+          <w:rFonts w:cs="Segoe UI Emoji"/>
+          <w:i/>
+          <w:iCs/>
+        </w:rPr>
+      </w:pPr>
+      <w:r>
+        <w:rPr>
+          <w:rFonts w:cs="Segoe UI Emoji"/>
+          <w:i/>
+          <w:iCs/>
+        </w:rPr>
+        <w:t>Play pretend…</w:t>
+      </w:r>
+    </w:p>
+    <w:p>
+      <w:pPr>
+        <w:jc w:val="both"/>
+        <w:rPr>
+          <w:rFonts w:cs="Segoe UI Emoji"/>
+          <w:i/>
+          <w:iCs/>
+        </w:rPr>
+      </w:pPr>
+      <w:r>
+        <w:rPr>
+          <w:rFonts w:cs="Segoe UI Emoji"/>
+          <w:i/>
+          <w:iCs/>
+        </w:rPr>
+        <w:t>Say you’ll miss me.</w:t>
+      </w:r>
+    </w:p>
+    <w:p>
+      <w:pPr>
+        <w:jc w:val="both"/>
+        <w:rPr>
+          <w:rFonts w:cs="Segoe UI Emoji"/>
+          <w:i/>
+          <w:iCs/>
+        </w:rPr>
+      </w:pPr>
+      <w:r>
+        <w:rPr>
+          <w:rFonts w:cs="Segoe UI Emoji"/>
+          <w:i/>
+          <w:iCs/>
+        </w:rPr>
+        <w:t>In the end…</w:t>
+      </w:r>
+    </w:p>
+    <w:p>
+      <w:pPr>
+        <w:jc w:val="both"/>
+        <w:rPr>
+          <w:rFonts w:cs="Segoe UI Emoji"/>
+          <w:i/>
+          <w:iCs/>
+        </w:rPr>
+      </w:pPr>
+      <w:r>
+        <w:rPr>
+          <w:rFonts w:cs="Segoe UI Emoji"/>
+          <w:i/>
+          <w:iCs/>
+        </w:rPr>
+        <w:t>It’s my one plea!</w:t>
+      </w:r>
+    </w:p>
+    <w:p>
+      <w:pPr>
         <w:rPr>
           <w:b/>
           <w:bCs/>
           <w:u w:val="single"/>
         </w:rPr>
-        <w:t>:</w:t>
-      </w:r>
-    </w:p>
-    <w:p>
-      <w:pPr>
-        <w:jc w:val="both"/>
-        <w:rPr>
-          <w:rFonts w:cs="Segoe UI Emoji"/>
-          <w:i/>
-          <w:iCs/>
-        </w:rPr>
-      </w:pPr>
-      <w:r>
-        <w:rPr>
-          <w:rFonts w:cs="Segoe UI Emoji"/>
-          <w:i/>
-          <w:iCs/>
-        </w:rPr>
-        <w:t>Wendy darling,</w:t>
-      </w:r>
-    </w:p>
-    <w:p>
-      <w:pPr>
-        <w:jc w:val="both"/>
-        <w:rPr>
-          <w:rFonts w:cs="Segoe UI Emoji"/>
-          <w:i/>
-          <w:iCs/>
-        </w:rPr>
-      </w:pPr>
-      <w:r>
-        <w:rPr>
-          <w:rFonts w:cs="Segoe UI Emoji"/>
-          <w:i/>
-          <w:iCs/>
-        </w:rPr>
-        <w:t>Your eyes, sterling,</w:t>
-      </w:r>
-    </w:p>
-    <w:p>
-      <w:pPr>
-        <w:jc w:val="both"/>
-        <w:rPr>
-          <w:rFonts w:cs="Segoe UI Emoji"/>
-          <w:i/>
-          <w:iCs/>
-        </w:rPr>
-      </w:pPr>
-      <w:r>
-        <w:rPr>
-          <w:rFonts w:cs="Segoe UI Emoji"/>
-          <w:i/>
-          <w:iCs/>
-        </w:rPr>
-        <w:t>End me, darling!</w:t>
-      </w:r>
-    </w:p>
-    <w:p>
-      <w:pPr>
-        <w:jc w:val="both"/>
-        <w:rPr>
-          <w:rFonts w:cs="Segoe UI Emoji"/>
-          <w:i/>
-          <w:iCs/>
-        </w:rPr>
-      </w:pPr>
-      <w:r>
-        <w:rPr>
-          <w:rFonts w:cs="Segoe UI Emoji"/>
-          <w:i/>
-          <w:iCs/>
-        </w:rPr>
-        <w:t>Heart’s unfurling.</w:t>
-      </w:r>
-    </w:p>
-    <w:p>
-      <w:pPr>
-        <w:jc w:val="both"/>
-        <w:rPr>
-          <w:rFonts w:cs="Segoe UI Emoji"/>
-          <w:i/>
-          <w:iCs/>
-        </w:rPr>
-      </w:pPr>
-      <w:proofErr w:type="gramStart"/>
-      <w:r>
-        <w:rPr>
-          <w:rFonts w:cs="Segoe UI Emoji"/>
-          <w:i/>
-          <w:iCs/>
-        </w:rPr>
-        <w:t>Kiss</w:t>
-      </w:r>
-      <w:proofErr w:type="gramEnd"/>
-      <w:r>
-        <w:rPr>
-          <w:rFonts w:cs="Segoe UI Emoji"/>
-          <w:i/>
-          <w:iCs/>
-        </w:rPr>
-        <w:t xml:space="preserve">. Ease hooks </w:t>
-      </w:r>
-      <w:proofErr w:type="gramStart"/>
-      <w:r>
-        <w:rPr>
-          <w:rFonts w:cs="Segoe UI Emoji"/>
-          <w:i/>
-          <w:iCs/>
-        </w:rPr>
-        <w:t>in</w:t>
-      </w:r>
-      <w:proofErr w:type="gramEnd"/>
-      <w:r>
-        <w:rPr>
-          <w:rFonts w:cs="Segoe UI Emoji"/>
-          <w:i/>
-          <w:iCs/>
-        </w:rPr>
-        <w:t xml:space="preserve"> me.</w:t>
-      </w:r>
-    </w:p>
-    <w:p>
-      <w:pPr>
-        <w:jc w:val="both"/>
-        <w:rPr>
-          <w:rFonts w:cs="Segoe UI Emoji"/>
-          <w:i/>
-          <w:iCs/>
-        </w:rPr>
-      </w:pPr>
-      <w:r>
-        <w:rPr>
-          <w:rFonts w:cs="Segoe UI Emoji"/>
-          <w:i/>
-          <w:iCs/>
-        </w:rPr>
-        <w:t>Miss. Please set me free!</w:t>
-      </w:r>
-    </w:p>
-    <w:p>
-      <w:pPr>
-        <w:jc w:val="both"/>
-        <w:rPr>
-          <w:rFonts w:cs="Segoe UI Emoji"/>
-          <w:i/>
-          <w:iCs/>
-        </w:rPr>
-      </w:pPr>
-      <w:r>
-        <w:rPr>
-          <w:rFonts w:cs="Segoe UI Emoji"/>
-          <w:i/>
-          <w:iCs/>
-        </w:rPr>
-        <w:t>Play pretend…</w:t>
-      </w:r>
-    </w:p>
-    <w:p>
-      <w:pPr>
-        <w:jc w:val="both"/>
-        <w:rPr>
-          <w:rFonts w:cs="Segoe UI Emoji"/>
-          <w:i/>
-          <w:iCs/>
-        </w:rPr>
-      </w:pPr>
-      <w:r>
-        <w:rPr>
-          <w:rFonts w:cs="Segoe UI Emoji"/>
-          <w:i/>
-          <w:iCs/>
-        </w:rPr>
-        <w:t>Say you’ll miss me.</w:t>
-      </w:r>
-    </w:p>
-    <w:p>
-      <w:pPr>
-        <w:jc w:val="both"/>
-        <w:rPr>
-          <w:rFonts w:cs="Segoe UI Emoji"/>
-          <w:i/>
-          <w:iCs/>
-        </w:rPr>
-      </w:pPr>
-      <w:r>
-        <w:rPr>
-          <w:rFonts w:cs="Segoe UI Emoji"/>
-          <w:i/>
-          <w:iCs/>
-        </w:rPr>
-        <w:t>In the end…</w:t>
-      </w:r>
-    </w:p>
-    <w:p>
-      <w:pPr>
-        <w:jc w:val="both"/>
-        <w:rPr>
-          <w:rFonts w:cs="Segoe UI Emoji"/>
-          <w:i/>
-          <w:iCs/>
-        </w:rPr>
-      </w:pPr>
-      <w:r>
-        <w:rPr>
-          <w:rFonts w:cs="Segoe UI Emoji"/>
-          <w:i/>
-          <w:iCs/>
-        </w:rPr>
-        <w:t>It’s my one plea!</w:t>
-      </w:r>
-    </w:p>
-    <w:p>
-      <w:pPr>
+      </w:pPr>
+      <w:r>
         <w:rPr>
           <w:b/>
           <w:bCs/>
           <w:u w:val="single"/>
         </w:rPr>
-      </w:pPr>
+        <w:t>Binary System</w:t>
+      </w:r>
       <w:r>
         <w:rPr>
           <w:b/>
           <w:bCs/>
           <w:u w:val="single"/>
         </w:rPr>
-        <w:t>Binary System</w:t>
+        <w:t>s</w:t>
       </w:r>
       <w:r>
         <w:rPr>
@@ -415,368 +385,342 @@
           <w:bCs/>
           <w:u w:val="single"/>
         </w:rPr>
-        <w:t>s</w:t>
-      </w:r>
-      <w:r>
+        <w:t>:</w:t>
+      </w:r>
+    </w:p>
+    <w:p>
+      <w:pPr>
+        <w:rPr>
+          <w:rFonts w:cs="Segoe UI Emoji"/>
+          <w:i/>
+          <w:iCs/>
+        </w:rPr>
+      </w:pPr>
+      <w:r>
+        <w:rPr>
+          <w:rFonts w:cs="Segoe UI Emoji"/>
+          <w:i/>
+          <w:iCs/>
+        </w:rPr>
+        <w:t xml:space="preserve">Not all things are binary. </w:t>
+      </w:r>
+    </w:p>
+    <w:p>
+      <w:pPr>
+        <w:rPr>
+          <w:rFonts w:cs="Segoe UI Emoji"/>
+          <w:i/>
+          <w:iCs/>
+        </w:rPr>
+      </w:pPr>
+      <w:r>
+        <w:rPr>
+          <w:rFonts w:cs="Segoe UI Emoji"/>
+          <w:i/>
+          <w:iCs/>
+        </w:rPr>
+        <w:t xml:space="preserve">Some things are analog. </w:t>
+      </w:r>
+    </w:p>
+    <w:p>
+      <w:pPr>
+        <w:rPr>
+          <w:rFonts w:cs="Segoe UI Emoji"/>
+          <w:i/>
+          <w:iCs/>
+        </w:rPr>
+      </w:pPr>
+      <w:r>
+        <w:rPr>
+          <w:rFonts w:cs="Segoe UI Emoji"/>
+          <w:i/>
+          <w:iCs/>
+        </w:rPr>
+        <w:t>Many find this scary.</w:t>
+      </w:r>
+    </w:p>
+    <w:p>
+      <w:pPr>
+        <w:rPr>
+          <w:rFonts w:cs="Segoe UI Emoji"/>
+          <w:i/>
+          <w:iCs/>
+        </w:rPr>
+      </w:pPr>
+      <w:r>
+        <w:rPr>
+          <w:rFonts w:cs="Segoe UI Emoji"/>
+          <w:i/>
+          <w:iCs/>
+        </w:rPr>
+        <w:t>Can’t fit their boxy blog.</w:t>
+      </w:r>
+    </w:p>
+    <w:p>
+      <w:pPr>
+        <w:rPr>
+          <w:rFonts w:cs="Segoe UI Emoji"/>
+          <w:i/>
+          <w:iCs/>
+        </w:rPr>
+      </w:pPr>
+      <w:r>
+        <w:rPr>
+          <w:rFonts w:cs="Segoe UI Emoji"/>
+          <w:i/>
+          <w:iCs/>
+        </w:rPr>
+        <w:t>Many are analog and binary.</w:t>
+      </w:r>
+    </w:p>
+    <w:p>
+      <w:pPr>
+        <w:rPr>
+          <w:rFonts w:cs="Segoe UI Emoji"/>
+          <w:i/>
+          <w:iCs/>
+        </w:rPr>
+      </w:pPr>
+      <w:r>
+        <w:rPr>
+          <w:rFonts w:cs="Segoe UI Emoji"/>
+          <w:i/>
+          <w:iCs/>
+        </w:rPr>
+        <w:t>Some things are somehow not, given that.</w:t>
+      </w:r>
+    </w:p>
+    <w:p>
+      <w:pPr>
+        <w:rPr>
+          <w:rFonts w:cs="Segoe UI Emoji"/>
+          <w:i/>
+          <w:iCs/>
+        </w:rPr>
+      </w:pPr>
+      <w:r>
+        <w:rPr>
+          <w:rFonts w:cs="Segoe UI Emoji"/>
+          <w:i/>
+          <w:iCs/>
+        </w:rPr>
+        <w:t>It’s totally all arbitrary.</w:t>
+      </w:r>
+    </w:p>
+    <w:p>
+      <w:pPr>
+        <w:rPr>
+          <w:rFonts w:cs="Segoe UI Emoji"/>
+          <w:i/>
+          <w:iCs/>
+        </w:rPr>
+      </w:pPr>
+      <w:r>
+        <w:rPr>
+          <w:rFonts w:cs="Segoe UI Emoji"/>
+          <w:i/>
+          <w:iCs/>
+        </w:rPr>
+        <w:lastRenderedPageBreak/>
+        <w:t>Come with me and put on a mad hat.</w:t>
+      </w:r>
+    </w:p>
+    <w:p>
+      <w:pPr>
         <w:rPr>
           <w:b/>
           <w:bCs/>
           <w:u w:val="single"/>
         </w:rPr>
-        <w:t>:</w:t>
-      </w:r>
-    </w:p>
-    <w:p>
-      <w:pPr>
-        <w:rPr>
-          <w:rFonts w:cs="Segoe UI Emoji"/>
-          <w:i/>
-          <w:iCs/>
-        </w:rPr>
-      </w:pPr>
-      <w:r>
-        <w:rPr>
-          <w:rFonts w:cs="Segoe UI Emoji"/>
-          <w:i/>
-          <w:iCs/>
-        </w:rPr>
-        <w:t xml:space="preserve">Not all things are binary. </w:t>
-      </w:r>
-    </w:p>
-    <w:p>
-      <w:pPr>
-        <w:rPr>
-          <w:rFonts w:cs="Segoe UI Emoji"/>
-          <w:i/>
-          <w:iCs/>
-        </w:rPr>
-      </w:pPr>
-      <w:r>
-        <w:rPr>
-          <w:rFonts w:cs="Segoe UI Emoji"/>
-          <w:i/>
-          <w:iCs/>
-        </w:rPr>
-        <w:t xml:space="preserve">Some things are analog. </w:t>
-      </w:r>
-    </w:p>
-    <w:p>
-      <w:pPr>
-        <w:rPr>
-          <w:rFonts w:cs="Segoe UI Emoji"/>
-          <w:i/>
-          <w:iCs/>
-        </w:rPr>
-      </w:pPr>
-      <w:r>
-        <w:rPr>
-          <w:rFonts w:cs="Segoe UI Emoji"/>
-          <w:i/>
-          <w:iCs/>
-        </w:rPr>
-        <w:t>Many find this scary.</w:t>
-      </w:r>
-    </w:p>
-    <w:p>
-      <w:pPr>
-        <w:rPr>
-          <w:rFonts w:cs="Segoe UI Emoji"/>
-          <w:i/>
-          <w:iCs/>
-        </w:rPr>
-      </w:pPr>
-      <w:r>
-        <w:rPr>
-          <w:rFonts w:cs="Segoe UI Emoji"/>
-          <w:i/>
-          <w:iCs/>
-        </w:rPr>
-        <w:t>Can’t fit their boxy blog.</w:t>
-      </w:r>
-    </w:p>
-    <w:p>
-      <w:pPr>
-        <w:rPr>
-          <w:rFonts w:cs="Segoe UI Emoji"/>
-          <w:i/>
-          <w:iCs/>
-        </w:rPr>
-      </w:pPr>
-      <w:r>
-        <w:rPr>
-          <w:rFonts w:cs="Segoe UI Emoji"/>
-          <w:i/>
-          <w:iCs/>
-        </w:rPr>
-        <w:t>Many are analog and binary.</w:t>
-      </w:r>
-    </w:p>
-    <w:p>
-      <w:pPr>
-        <w:rPr>
-          <w:rFonts w:cs="Segoe UI Emoji"/>
-          <w:i/>
-          <w:iCs/>
-        </w:rPr>
-      </w:pPr>
-      <w:r>
-        <w:rPr>
-          <w:rFonts w:cs="Segoe UI Emoji"/>
-          <w:i/>
-          <w:iCs/>
-        </w:rPr>
-        <w:t>Some things are somehow not, given that.</w:t>
-      </w:r>
-    </w:p>
-    <w:p>
-      <w:pPr>
-        <w:rPr>
-          <w:rFonts w:cs="Segoe UI Emoji"/>
-          <w:i/>
-          <w:iCs/>
-        </w:rPr>
-      </w:pPr>
-      <w:r>
-        <w:rPr>
-          <w:rFonts w:cs="Segoe UI Emoji"/>
-          <w:i/>
-          <w:iCs/>
-        </w:rPr>
-        <w:t xml:space="preserve">It’s </w:t>
-      </w:r>
-      <w:proofErr w:type="gramStart"/>
-      <w:r>
-        <w:rPr>
-          <w:rFonts w:cs="Segoe UI Emoji"/>
-          <w:i/>
-          <w:iCs/>
-        </w:rPr>
-        <w:t>totally all</w:t>
-      </w:r>
-      <w:proofErr w:type="gramEnd"/>
-      <w:r>
-        <w:rPr>
-          <w:rFonts w:cs="Segoe UI Emoji"/>
-          <w:i/>
-          <w:iCs/>
-        </w:rPr>
-        <w:t xml:space="preserve"> arbitrary.</w:t>
-      </w:r>
-    </w:p>
-    <w:p>
-      <w:pPr>
-        <w:rPr>
-          <w:rFonts w:cs="Segoe UI Emoji"/>
-          <w:i/>
-          <w:iCs/>
-        </w:rPr>
-      </w:pPr>
-      <w:r>
-        <w:rPr>
-          <w:rFonts w:cs="Segoe UI Emoji"/>
-          <w:i/>
-          <w:iCs/>
-        </w:rPr>
-        <w:lastRenderedPageBreak/>
-        <w:t>Come with me and put on a mad hat.</w:t>
-      </w:r>
-    </w:p>
-    <w:p>
-      <w:pPr>
+      </w:pPr>
+      <w:r>
         <w:rPr>
           <w:b/>
           <w:bCs/>
           <w:u w:val="single"/>
         </w:rPr>
-      </w:pPr>
-      <w:r>
-        <w:rPr>
+        <w:t>It Tracks:</w:t>
+      </w:r>
+    </w:p>
+    <w:p>
+      <w:pPr>
+        <w:jc w:val="both"/>
+        <w:rPr>
+          <w:rFonts w:cs="Segoe UI Emoji"/>
+          <w:i/>
+          <w:iCs/>
+        </w:rPr>
+      </w:pPr>
+      <w:r>
+        <w:rPr>
+          <w:rFonts w:cs="Segoe UI Emoji"/>
+          <w:i/>
+          <w:iCs/>
+        </w:rPr>
+        <w:t>Tonight’s moon is blue,</w:t>
+      </w:r>
+    </w:p>
+    <w:p>
+      <w:pPr>
+        <w:jc w:val="both"/>
+        <w:rPr>
+          <w:rFonts w:cs="Segoe UI Emoji"/>
+          <w:i/>
+          <w:iCs/>
+        </w:rPr>
+      </w:pPr>
+      <w:r>
+        <w:rPr>
+          <w:rFonts w:cs="Segoe UI Emoji"/>
+          <w:i/>
+          <w:iCs/>
+        </w:rPr>
+        <w:t>I drive out seeking,</w:t>
+      </w:r>
+    </w:p>
+    <w:p>
+      <w:pPr>
+        <w:jc w:val="both"/>
+        <w:rPr>
+          <w:rFonts w:cs="Segoe UI Emoji"/>
+          <w:i/>
+          <w:iCs/>
+        </w:rPr>
+      </w:pPr>
+      <w:r>
+        <w:rPr>
+          <w:rFonts w:cs="Segoe UI Emoji"/>
+          <w:i/>
+          <w:iCs/>
+        </w:rPr>
+        <w:t>A train and its tracks.</w:t>
+      </w:r>
+    </w:p>
+    <w:p>
+      <w:pPr>
+        <w:jc w:val="both"/>
+        <w:rPr>
+          <w:rFonts w:cs="Segoe UI Emoji"/>
+          <w:i/>
+          <w:iCs/>
+        </w:rPr>
+      </w:pPr>
+      <w:r>
+        <w:rPr>
+          <w:rFonts w:cs="Segoe UI Emoji"/>
+          <w:i/>
+          <w:iCs/>
+        </w:rPr>
+        <w:t>So much I must do,</w:t>
+      </w:r>
+    </w:p>
+    <w:p>
+      <w:pPr>
+        <w:jc w:val="both"/>
+        <w:rPr>
+          <w:rFonts w:cs="Segoe UI Emoji"/>
+          <w:i/>
+          <w:iCs/>
+        </w:rPr>
+      </w:pPr>
+      <w:r>
+        <w:rPr>
+          <w:rFonts w:cs="Segoe UI Emoji"/>
+          <w:i/>
+          <w:iCs/>
+        </w:rPr>
+        <w:t>And I am screeching,</w:t>
+      </w:r>
+    </w:p>
+    <w:p>
+      <w:pPr>
+        <w:jc w:val="both"/>
+        <w:rPr>
+          <w:rFonts w:cs="Segoe UI Emoji"/>
+          <w:i/>
+          <w:iCs/>
+        </w:rPr>
+      </w:pPr>
+      <w:r>
+        <w:rPr>
+          <w:rFonts w:cs="Segoe UI Emoji"/>
+          <w:i/>
+          <w:iCs/>
+        </w:rPr>
+        <w:t>For what my soul lacks.</w:t>
+      </w:r>
+    </w:p>
+    <w:p>
+      <w:pPr>
+        <w:jc w:val="both"/>
+        <w:rPr>
+          <w:rFonts w:cs="Segoe UI Emoji"/>
+          <w:i/>
+          <w:iCs/>
+        </w:rPr>
+      </w:pPr>
+      <w:r>
+        <w:rPr>
+          <w:rFonts w:cs="Segoe UI Emoji"/>
+          <w:i/>
+          <w:iCs/>
+        </w:rPr>
+        <w:t>I haven’t a clue,</w:t>
+      </w:r>
+    </w:p>
+    <w:p>
+      <w:pPr>
+        <w:jc w:val="both"/>
+        <w:rPr>
+          <w:rFonts w:cs="Segoe UI Emoji"/>
+          <w:i/>
+          <w:iCs/>
+        </w:rPr>
+      </w:pPr>
+      <w:r>
+        <w:rPr>
+          <w:rFonts w:cs="Segoe UI Emoji"/>
+          <w:i/>
+          <w:iCs/>
+        </w:rPr>
+        <w:t>How it’s still leaking.</w:t>
+      </w:r>
+    </w:p>
+    <w:p>
+      <w:pPr>
+        <w:jc w:val="both"/>
+        <w:rPr>
+          <w:rFonts w:cs="Segoe UI Emoji"/>
+          <w:i/>
+          <w:iCs/>
+        </w:rPr>
+      </w:pPr>
+      <w:r>
+        <w:rPr>
+          <w:rFonts w:cs="Segoe UI Emoji"/>
+          <w:i/>
+          <w:iCs/>
+        </w:rPr>
+        <w:t>One more of its acts?</w:t>
+      </w:r>
+    </w:p>
+    <w:p>
+      <w:pPr>
+        <w:jc w:val="both"/>
+        <w:rPr>
+          <w:rFonts w:cs="Segoe UI Emoji"/>
           <w:b/>
           <w:bCs/>
           <w:u w:val="single"/>
         </w:rPr>
-        <w:t>It Tracks:</w:t>
-      </w:r>
-    </w:p>
-    <w:p>
-      <w:pPr>
-        <w:jc w:val="both"/>
-        <w:rPr>
-          <w:rFonts w:cs="Segoe UI Emoji"/>
-          <w:i/>
-          <w:iCs/>
-        </w:rPr>
-      </w:pPr>
-      <w:r>
-        <w:rPr>
-          <w:rFonts w:cs="Segoe UI Emoji"/>
-          <w:i/>
-          <w:iCs/>
-        </w:rPr>
-        <w:t>Tonight’s moon is blue,</w:t>
-      </w:r>
-    </w:p>
-    <w:p>
-      <w:pPr>
-        <w:jc w:val="both"/>
-        <w:rPr>
-          <w:rFonts w:cs="Segoe UI Emoji"/>
-          <w:i/>
-          <w:iCs/>
-        </w:rPr>
-      </w:pPr>
-      <w:r>
-        <w:rPr>
-          <w:rFonts w:cs="Segoe UI Emoji"/>
-          <w:i/>
-          <w:iCs/>
-        </w:rPr>
-        <w:t>I drive out seeking,</w:t>
-      </w:r>
-    </w:p>
-    <w:p>
-      <w:pPr>
-        <w:jc w:val="both"/>
-        <w:rPr>
-          <w:rFonts w:cs="Segoe UI Emoji"/>
-          <w:i/>
-          <w:iCs/>
-        </w:rPr>
-      </w:pPr>
-      <w:r>
-        <w:rPr>
-          <w:rFonts w:cs="Segoe UI Emoji"/>
-          <w:i/>
-          <w:iCs/>
-        </w:rPr>
-        <w:t>A train and its tracks.</w:t>
-      </w:r>
-    </w:p>
-    <w:p>
-      <w:pPr>
-        <w:jc w:val="both"/>
-        <w:rPr>
-          <w:rFonts w:cs="Segoe UI Emoji"/>
-          <w:i/>
-          <w:iCs/>
-        </w:rPr>
-      </w:pPr>
-      <w:r>
-        <w:rPr>
-          <w:rFonts w:cs="Segoe UI Emoji"/>
-          <w:i/>
-          <w:iCs/>
-        </w:rPr>
-        <w:t>So much I must do,</w:t>
-      </w:r>
-    </w:p>
-    <w:p>
-      <w:pPr>
-        <w:jc w:val="both"/>
-        <w:rPr>
-          <w:rFonts w:cs="Segoe UI Emoji"/>
-          <w:i/>
-          <w:iCs/>
-        </w:rPr>
-      </w:pPr>
-      <w:r>
-        <w:rPr>
-          <w:rFonts w:cs="Segoe UI Emoji"/>
-          <w:i/>
-          <w:iCs/>
-        </w:rPr>
-        <w:t>And I am screeching,</w:t>
-      </w:r>
-    </w:p>
-    <w:p>
-      <w:pPr>
-        <w:jc w:val="both"/>
-        <w:rPr>
-          <w:rFonts w:cs="Segoe UI Emoji"/>
-          <w:i/>
-          <w:iCs/>
-        </w:rPr>
-      </w:pPr>
-      <w:r>
-        <w:rPr>
-          <w:rFonts w:cs="Segoe UI Emoji"/>
-          <w:i/>
-          <w:iCs/>
-        </w:rPr>
-        <w:t>For what my soul lacks.</w:t>
-      </w:r>
-    </w:p>
-    <w:p>
-      <w:pPr>
-        <w:jc w:val="both"/>
-        <w:rPr>
-          <w:rFonts w:cs="Segoe UI Emoji"/>
-          <w:i/>
-          <w:iCs/>
-        </w:rPr>
-      </w:pPr>
-      <w:r>
-        <w:rPr>
-          <w:rFonts w:cs="Segoe UI Emoji"/>
-          <w:i/>
-          <w:iCs/>
-        </w:rPr>
-        <w:t>I haven’t a clue,</w:t>
-      </w:r>
-    </w:p>
-    <w:p>
-      <w:pPr>
-        <w:jc w:val="both"/>
-        <w:rPr>
-          <w:rFonts w:cs="Segoe UI Emoji"/>
-          <w:i/>
-          <w:iCs/>
-        </w:rPr>
-      </w:pPr>
-      <w:r>
-        <w:rPr>
-          <w:rFonts w:cs="Segoe UI Emoji"/>
-          <w:i/>
-          <w:iCs/>
-        </w:rPr>
-        <w:t>How it’s still leaking.</w:t>
-      </w:r>
-    </w:p>
-    <w:p>
-      <w:pPr>
-        <w:jc w:val="both"/>
-        <w:rPr>
-          <w:rFonts w:cs="Segoe UI Emoji"/>
-          <w:i/>
-          <w:iCs/>
-        </w:rPr>
-      </w:pPr>
-      <w:r>
-        <w:rPr>
-          <w:rFonts w:cs="Segoe UI Emoji"/>
-          <w:i/>
-          <w:iCs/>
-        </w:rPr>
-        <w:t>One more of its acts?</w:t>
-      </w:r>
-    </w:p>
-    <w:p>
-      <w:pPr>
-        <w:jc w:val="both"/>
+      </w:pPr>
+      <w:r>
         <w:rPr>
           <w:rFonts w:cs="Segoe UI Emoji"/>
           <w:b/>
           <w:bCs/>
           <w:u w:val="single"/>
         </w:rPr>
-      </w:pPr>
-      <w:r>
-        <w:rPr>
-          <w:rFonts w:cs="Segoe UI Emoji"/>
-          <w:b/>
-          <w:bCs/>
-          <w:u w:val="single"/>
-        </w:rPr>
         <w:t>Star Woven:</w:t>
       </w:r>
     </w:p>
@@ -807,23 +751,7 @@
           <w:i/>
           <w:iCs/>
         </w:rPr>
-        <w:t xml:space="preserve">Space crinkles at the </w:t>
-      </w:r>
-      <w:proofErr w:type="gramStart"/>
-      <w:r>
-        <w:rPr>
-          <w:i/>
-          <w:iCs/>
-        </w:rPr>
-        <w:t>seam</w:t>
-      </w:r>
-      <w:proofErr w:type="gramEnd"/>
-      <w:r>
-        <w:rPr>
-          <w:i/>
-          <w:iCs/>
-        </w:rPr>
-        <w:t>.</w:t>
+        <w:t>Space crinkles at the seam.</w:t>
       </w:r>
     </w:p>
     <w:p>

</xml_diff>